<commit_message>
docs(research): types-to-mechanisms collapse + world-true/context-true scope + tinyHippo entry criterion
Whitepaper S8 + roadmap PART 7: the many association TYPES collapse to 4 MECHANISMS (2 working:
similarity, LLM reasoning; 2 gaps: experiential co-activation, temporal structure) - build
mechanisms not types. World-true (parametric: metaphor, personification, conventional symbolism)
vs context-true (episodic, the faculty's job). Emergent personal symbolism = the concrete,
testable entry criterion that earns the attractor/replay substrate.

Co-Authored-By: Claude Opus 4.8 (1M context) <noreply@anthropic.com>
</commit_message>
<xml_diff>
--- a/docs/research/019-associative-memory-whitepaper.docx
+++ b/docs/research/019-associative-memory-whitepaper.docx
@@ -8776,7 +8776,721 @@
         <w:pStyle w:val="Heading1"/>
       </w:pPr>
       <w:r>
-        <w:t>8. Limitations and threats to validity</w:t>
+        <w:t>8. Association types vs. mechanisms (the scope of the faculty)</w:t>
+      </w:r>
+    </w:p>
+    <w:p>
+      <w:r>
+        <w:t>A fair worry on seeing the gaps arrive one at a time — co-occurrence, then supersession, then</w:t>
+      </w:r>
+    </w:p>
+    <w:p>
+      <w:r>
+        <w:t xml:space="preserve">role/skill — is that this is whack-a-mole: the real world has </w:t>
+      </w:r>
+      <w:r>
+        <w:rPr>
+          <w:i/>
+        </w:rPr>
+        <w:t>dozens</w:t>
+      </w:r>
+      <w:r>
+        <w:t xml:space="preserve"> of ways things associate</w:t>
+      </w:r>
+    </w:p>
+    <w:p>
+      <w:r>
+        <w:t>(causal, part-whole, analogy, goal-relevance, symbolic, cross-modal…), so will the backlog ever</w:t>
+      </w:r>
+    </w:p>
+    <w:p>
+      <w:r>
+        <w:t>end? The instrument's answer is no, because *</w:t>
+      </w:r>
+      <w:r>
+        <w:rPr>
+          <w:i/>
+        </w:rPr>
+        <w:t xml:space="preserve">the many association </w:t>
+      </w:r>
+      <w:r>
+        <w:t>types* collapse to a few</w:t>
+      </w:r>
+    </w:p>
+    <w:p>
+      <w:r>
+        <w:rPr>
+          <w:i/>
+        </w:rPr>
+        <w:t>mechanisms</w:t>
+      </w:r>
+      <w:r>
+        <w:t>, and most of them already work.**</w:t>
+      </w:r>
+    </w:p>
+    <w:tbl>
+      <w:tblPr>
+        <w:tblStyle w:val="LightGrid-Accent1"/>
+        <w:tblW w:type="auto" w:w="0"/>
+        <w:tblLook w:firstColumn="1" w:firstRow="1" w:lastColumn="0" w:lastRow="0" w:noHBand="0" w:noVBand="1" w:val="04A0"/>
+      </w:tblPr>
+      <w:tblGrid>
+        <w:gridCol w:w="2880"/>
+        <w:gridCol w:w="2880"/>
+        <w:gridCol w:w="2880"/>
+      </w:tblGrid>
+      <w:tr>
+        <w:tc>
+          <w:tcPr>
+            <w:tcW w:type="dxa" w:w="2880"/>
+          </w:tcPr>
+          <w:p>
+            <w:r/>
+            <w:r>
+              <w:rPr>
+                <w:b/>
+              </w:rPr>
+              <w:t>Mechanism</w:t>
+            </w:r>
+          </w:p>
+        </w:tc>
+        <w:tc>
+          <w:tcPr>
+            <w:tcW w:type="dxa" w:w="2880"/>
+          </w:tcPr>
+          <w:p>
+            <w:r/>
+            <w:r>
+              <w:rPr>
+                <w:b/>
+              </w:rPr>
+              <w:t>Association types it covers</w:t>
+            </w:r>
+          </w:p>
+        </w:tc>
+        <w:tc>
+          <w:tcPr>
+            <w:tcW w:type="dxa" w:w="2880"/>
+          </w:tcPr>
+          <w:p>
+            <w:r/>
+            <w:r>
+              <w:rPr>
+                <w:b/>
+              </w:rPr>
+              <w:t>Status</w:t>
+            </w:r>
+          </w:p>
+        </w:tc>
+      </w:tr>
+      <w:tr>
+        <w:tc>
+          <w:tcPr>
+            <w:tcW w:type="dxa" w:w="2880"/>
+          </w:tcPr>
+          <w:p>
+            <w:r/>
+            <w:r>
+              <w:rPr>
+                <w:b/>
+              </w:rPr>
+              <w:t>Similarity</w:t>
+            </w:r>
+            <w:r>
+              <w:t xml:space="preserve"> (embedding geometry)</w:t>
+            </w:r>
+          </w:p>
+        </w:tc>
+        <w:tc>
+          <w:tcPr>
+            <w:tcW w:type="dxa" w:w="2880"/>
+          </w:tcPr>
+          <w:p>
+            <w:r/>
+            <w:r>
+              <w:t>semantic, paraphrase, abstract/structural analogy, metaphorical proximity</w:t>
+            </w:r>
+          </w:p>
+        </w:tc>
+        <w:tc>
+          <w:tcPr>
+            <w:tcW w:type="dxa" w:w="2880"/>
+          </w:tcPr>
+          <w:p>
+            <w:r/>
+            <w:r>
+              <w:t>✅ works</w:t>
+            </w:r>
+          </w:p>
+        </w:tc>
+      </w:tr>
+      <w:tr>
+        <w:tc>
+          <w:tcPr>
+            <w:tcW w:type="dxa" w:w="2880"/>
+          </w:tcPr>
+          <w:p>
+            <w:r/>
+            <w:r>
+              <w:rPr>
+                <w:b/>
+              </w:rPr>
+              <w:t>LLM reasoning</w:t>
+            </w:r>
+            <w:r>
+              <w:t xml:space="preserve"> over what's in context</w:t>
+            </w:r>
+          </w:p>
+        </w:tc>
+        <w:tc>
+          <w:tcPr>
+            <w:tcW w:type="dxa" w:w="2880"/>
+          </w:tcPr>
+          <w:p>
+            <w:r/>
+            <w:r>
+              <w:t>causal, role/skill, part-whole, multi-hop, goal-relevance, contradiction, conceptual metaphor</w:t>
+            </w:r>
+          </w:p>
+        </w:tc>
+        <w:tc>
+          <w:tcPr>
+            <w:tcW w:type="dxa" w:w="2880"/>
+          </w:tcPr>
+          <w:p>
+            <w:r/>
+            <w:r>
+              <w:t>✅ works (if the facts are present)</w:t>
+            </w:r>
+          </w:p>
+        </w:tc>
+      </w:tr>
+      <w:tr>
+        <w:tc>
+          <w:tcPr>
+            <w:tcW w:type="dxa" w:w="2880"/>
+          </w:tcPr>
+          <w:p>
+            <w:r/>
+            <w:r>
+              <w:rPr>
+                <w:b/>
+              </w:rPr>
+              <w:t>Experiential co-activation</w:t>
+            </w:r>
+            <w:r>
+              <w:t xml:space="preserve"> (edge formed from co-occurrence, strengthened by use)</w:t>
+            </w:r>
+          </w:p>
+        </w:tc>
+        <w:tc>
+          <w:tcPr>
+            <w:tcW w:type="dxa" w:w="2880"/>
+          </w:tcPr>
+          <w:p>
+            <w:r/>
+            <w:r>
+              <w:t xml:space="preserve">episodic, contextual, "experienced-together" — </w:t>
+            </w:r>
+            <w:r>
+              <w:rPr>
+                <w:i/>
+              </w:rPr>
+              <w:t>regardless of the specific relation</w:t>
+            </w:r>
+          </w:p>
+        </w:tc>
+        <w:tc>
+          <w:tcPr>
+            <w:tcW w:type="dxa" w:w="2880"/>
+          </w:tcPr>
+          <w:p>
+            <w:r/>
+            <w:r>
+              <w:t>⬛ Gap 1</w:t>
+            </w:r>
+          </w:p>
+        </w:tc>
+      </w:tr>
+      <w:tr>
+        <w:tc>
+          <w:tcPr>
+            <w:tcW w:type="dxa" w:w="2880"/>
+          </w:tcPr>
+          <w:p>
+            <w:r/>
+            <w:r>
+              <w:rPr>
+                <w:b/>
+              </w:rPr>
+              <w:t>Temporal structure</w:t>
+            </w:r>
+            <w:r>
+              <w:t xml:space="preserve"> (event-date ordering / resolver)</w:t>
+            </w:r>
+          </w:p>
+        </w:tc>
+        <w:tc>
+          <w:tcPr>
+            <w:tcW w:type="dxa" w:w="2880"/>
+          </w:tcPr>
+          <w:p>
+            <w:r/>
+            <w:r>
+              <w:t>recency, supersession, before/after</w:t>
+            </w:r>
+          </w:p>
+        </w:tc>
+        <w:tc>
+          <w:tcPr>
+            <w:tcW w:type="dxa" w:w="2880"/>
+          </w:tcPr>
+          <w:p>
+            <w:r/>
+            <w:r>
+              <w:t>⬛ Gap 2</w:t>
+            </w:r>
+          </w:p>
+        </w:tc>
+      </w:tr>
+    </w:tbl>
+    <w:p/>
+    <w:p>
+      <w:r>
+        <w:t>Every one of the 18 cells fell into these four; none escaped. We are not fixing types — we are</w:t>
+      </w:r>
+    </w:p>
+    <w:p>
+      <w:r>
+        <w:t xml:space="preserve">building the </w:t>
+      </w:r>
+      <w:r>
+        <w:rPr>
+          <w:b/>
+        </w:rPr>
+        <w:t>two missing mechanisms</w:t>
+      </w:r>
+      <w:r>
+        <w:t>. The formatter fix that surfaced graph-neighbours is itself</w:t>
+      </w:r>
+    </w:p>
+    <w:p>
+      <w:r>
+        <w:t xml:space="preserve">type-agnostic: it renders neighbours of </w:t>
+      </w:r>
+      <w:r>
+        <w:rPr>
+          <w:i/>
+        </w:rPr>
+        <w:t>any</w:t>
+      </w:r>
+      <w:r>
+        <w:t xml:space="preserve"> relation, and the LLM reads the relation label and</w:t>
+      </w:r>
+    </w:p>
+    <w:p>
+      <w:r>
+        <w:t>interprets. Two refinements sharpen the scope:</w:t>
+      </w:r>
+    </w:p>
+    <w:p>
+      <w:pPr>
+        <w:pStyle w:val="Heading2"/>
+      </w:pPr>
+      <w:r>
+        <w:t>8.1 World-true vs. context-true associations</w:t>
+      </w:r>
+    </w:p>
+    <w:p>
+      <w:r>
+        <w:t>There are two fundamentally different kinds of association, and the memory faculty owns only one:</w:t>
+      </w:r>
+    </w:p>
+    <w:p>
+      <w:pPr>
+        <w:pStyle w:val="ListBullet"/>
+      </w:pPr>
+      <w:r>
+        <w:rPr>
+          <w:b/>
+        </w:rPr>
+        <w:t>World-true</w:t>
+      </w:r>
+      <w:r>
+        <w:t xml:space="preserve"> — how concepts relate </w:t>
+      </w:r>
+      <w:r>
+        <w:rPr>
+          <w:i/>
+        </w:rPr>
+        <w:t>in general</w:t>
+      </w:r>
+      <w:r>
+        <w:t xml:space="preserve"> ("anger looks like turbulence"; "loud and</w:t>
+      </w:r>
+    </w:p>
+    <w:p>
+      <w:r>
+        <w:t>bright are both high-intensity"; "a ring conventionally signifies marriage"). These are</w:t>
+      </w:r>
+    </w:p>
+    <w:p>
+      <w:r>
+        <w:rPr>
+          <w:b/>
+        </w:rPr>
+        <w:t>parametric</w:t>
+      </w:r>
+      <w:r>
+        <w:t>: already carried by the LLM and the embedding from training. The faculty should</w:t>
+      </w:r>
+    </w:p>
+    <w:p>
+      <w:r>
+        <w:rPr>
+          <w:i/>
+        </w:rPr>
+        <w:t>not</w:t>
+      </w:r>
+      <w:r>
+        <w:t xml:space="preserve"> re-derive them.</w:t>
+      </w:r>
+    </w:p>
+    <w:p>
+      <w:pPr>
+        <w:pStyle w:val="ListBullet"/>
+      </w:pPr>
+      <w:r>
+        <w:rPr>
+          <w:b/>
+        </w:rPr>
+        <w:t>Context-true</w:t>
+      </w:r>
+      <w:r>
+        <w:t xml:space="preserve"> — what is true of </w:t>
+      </w:r>
+      <w:r>
+        <w:rPr>
+          <w:i/>
+        </w:rPr>
+        <w:t>this user/situation</w:t>
+      </w:r>
+      <w:r>
+        <w:t xml:space="preserve"> ("my grandfather's watch means</w:t>
+      </w:r>
+    </w:p>
+    <w:p>
+      <w:r>
+        <w:t xml:space="preserve">resilience </w:t>
+      </w:r>
+      <w:r>
+        <w:rPr>
+          <w:i/>
+        </w:rPr>
+        <w:t>to me</w:t>
+      </w:r>
+      <w:r>
+        <w:t xml:space="preserve">"). These are </w:t>
+      </w:r>
+      <w:r>
+        <w:rPr>
+          <w:b/>
+        </w:rPr>
+        <w:t>episodic</w:t>
+      </w:r>
+      <w:r>
+        <w:t>: they don't exist until experience creates them, so</w:t>
+      </w:r>
+    </w:p>
+    <w:p>
+      <w:r>
+        <w:t>they must be learned and stored. This is the faculty's job.</w:t>
+      </w:r>
+    </w:p>
+    <w:p>
+      <w:r>
+        <w:t xml:space="preserve">This dissolves a whole apparent class of "hard" associations. </w:t>
+      </w:r>
+      <w:r>
+        <w:rPr>
+          <w:b/>
+        </w:rPr>
+        <w:t>Synesthesia / cross-modal</w:t>
+      </w:r>
+    </w:p>
+    <w:p>
+      <w:r>
+        <w:t xml:space="preserve">("a loud colour"), </w:t>
+      </w:r>
+      <w:r>
+        <w:rPr>
+          <w:b/>
+        </w:rPr>
+        <w:t>personification</w:t>
+      </w:r>
+      <w:r>
+        <w:t xml:space="preserve"> ("the ocean is angry"), and </w:t>
+      </w:r>
+      <w:r>
+        <w:rPr>
+          <w:b/>
+        </w:rPr>
+        <w:t>conventional symbolism</w:t>
+      </w:r>
+    </w:p>
+    <w:p>
+      <w:r>
+        <w:t xml:space="preserve">(ring → marriage, flag → nation) are largely </w:t>
+      </w:r>
+      <w:r>
+        <w:rPr>
+          <w:i/>
+        </w:rPr>
+        <w:t>world-true</w:t>
+      </w:r>
+      <w:r>
+        <w:t xml:space="preserve"> — the LLM does conceptual metaphor and</w:t>
+      </w:r>
+    </w:p>
+    <w:p>
+      <w:r>
+        <w:t>structure-mapping natively, and the embedding already places metaphorically-linked terms near each</w:t>
+      </w:r>
+    </w:p>
+    <w:p>
+      <w:r>
+        <w:t>other (Phase-0 confirmed it spans abstract structure). They feel exotic but are home turf for a</w:t>
+      </w:r>
+    </w:p>
+    <w:p>
+      <w:r>
+        <w:t xml:space="preserve">model trained on human metaphor. For a </w:t>
+      </w:r>
+      <w:r>
+        <w:rPr>
+          <w:i/>
+        </w:rPr>
+        <w:t>text</w:t>
+      </w:r>
+      <w:r>
+        <w:t xml:space="preserve"> agent, cross-modal binding reduces to embedding</w:t>
+      </w:r>
+    </w:p>
+    <w:p>
+      <w:r>
+        <w:t>proximity; genuine multimodal binding is a joint-embedding (representation) question, not a memory</w:t>
+      </w:r>
+    </w:p>
+    <w:p>
+      <w:r>
+        <w:t>one. None of these require a new memory mechanism.</w:t>
+      </w:r>
+    </w:p>
+    <w:p>
+      <w:pPr>
+        <w:pStyle w:val="Heading2"/>
+      </w:pPr>
+      <w:r>
+        <w:t>8.2 Emergent personal symbolism — the earned entry for an attractor substrate</w:t>
+      </w:r>
+    </w:p>
+    <w:p>
+      <w:r>
+        <w:t xml:space="preserve">The genuinely memory-relevant slice is </w:t>
+      </w:r>
+      <w:r>
+        <w:rPr>
+          <w:b/>
+        </w:rPr>
+        <w:t>personal symbolism</w:t>
+      </w:r>
+      <w:r>
+        <w:t>, which splits once more:</w:t>
+      </w:r>
+    </w:p>
+    <w:p>
+      <w:pPr>
+        <w:pStyle w:val="ListBullet"/>
+      </w:pPr>
+      <w:r>
+        <w:rPr>
+          <w:b/>
+        </w:rPr>
+        <w:t>Explicit</w:t>
+      </w:r>
+      <w:r>
+        <w:t xml:space="preserve"> ("this watch means resilience to me" — stated) → stored as a fact, retrieved,</w:t>
+      </w:r>
+    </w:p>
+    <w:p>
+      <w:r>
+        <w:t>applied. Covered by similarity + LLM.</w:t>
+      </w:r>
+    </w:p>
+    <w:p>
+      <w:pPr>
+        <w:pStyle w:val="ListBullet"/>
+      </w:pPr>
+      <w:r>
+        <w:rPr>
+          <w:b/>
+        </w:rPr>
+        <w:t>Emergent / implicit</w:t>
+      </w:r>
+      <w:r>
+        <w:t xml:space="preserve"> — the user </w:t>
+      </w:r>
+      <w:r>
+        <w:rPr>
+          <w:i/>
+        </w:rPr>
+        <w:t>never states</w:t>
+      </w:r>
+      <w:r>
+        <w:t xml:space="preserve"> the symbol, but it is latent in a *recurring</w:t>
+      </w:r>
+    </w:p>
+    <w:p>
+      <w:r>
+        <w:t>pattern* (every mention of the watch coincides with talk of hard times). Inferring "the watch</w:t>
+      </w:r>
+    </w:p>
+    <w:p>
+      <w:r>
+        <w:t xml:space="preserve">symbolises resilience for this user" from a co-activation pattern </w:t>
+      </w:r>
+      <w:r>
+        <w:rPr>
+          <w:b/>
+        </w:rPr>
+        <w:t>across many episodes</w:t>
+      </w:r>
+      <w:r>
+        <w:t xml:space="preserve"> is</w:t>
+      </w:r>
+    </w:p>
+    <w:p>
+      <w:r>
+        <w:t xml:space="preserve">covered by </w:t>
+      </w:r>
+      <w:r>
+        <w:rPr>
+          <w:i/>
+        </w:rPr>
+        <w:t>nothing we have built</w:t>
+      </w:r>
+      <w:r>
+        <w:t>.</w:t>
+      </w:r>
+    </w:p>
+    <w:p>
+      <w:r>
+        <w:t xml:space="preserve">This emergent case is not a fifth mechanism — it is a </w:t>
+      </w:r>
+      <w:r>
+        <w:rPr>
+          <w:i/>
+        </w:rPr>
+        <w:t>composition</w:t>
+      </w:r>
+      <w:r>
+        <w:t xml:space="preserve"> of </w:t>
+      </w:r>
+      <w:r>
+        <w:rPr>
+          <w:b/>
+        </w:rPr>
+        <w:t>Gap 1</w:t>
+      </w:r>
+      <w:r>
+        <w:t xml:space="preserve"> (co-activation</w:t>
+      </w:r>
+    </w:p>
+    <w:p>
+      <w:r>
+        <w:t xml:space="preserve">detection) </w:t>
+      </w:r>
+      <w:r>
+        <w:rPr>
+          <w:b/>
+        </w:rPr>
+        <w:t>plus the LLM-as-cortex naming the pattern during consolidation</w:t>
+      </w:r>
+      <w:r>
+        <w:t>. But it stresses a</w:t>
+      </w:r>
+    </w:p>
+    <w:p>
+      <w:r>
+        <w:t>capability pairwise-edge formation lacks: **discovering and naming a latent association from a</w:t>
+      </w:r>
+    </w:p>
+    <w:p>
+      <w:r>
+        <w:t>statistical pattern over the whole history**, not from a single co-occurrence. Reconstructing a</w:t>
+      </w:r>
+    </w:p>
+    <w:p>
+      <w:r>
+        <w:t>coherent association (watch ⇄ resilience) from many partial, noisy co-activations is exactly what an</w:t>
+      </w:r>
+    </w:p>
+    <w:p>
+      <w:r>
+        <w:t>attractor / dense-associative (Hopfield-style) network or replay-consolidation does that edge</w:t>
+      </w:r>
+    </w:p>
+    <w:p>
+      <w:r>
+        <w:t>counting cannot. **This is the concrete, discriminating need that would justify the heavy substrate</w:t>
+      </w:r>
+    </w:p>
+    <w:p>
+      <w:r>
+        <w:t>(the "tinyHippo" rung)*</w:t>
+      </w:r>
+      <w:r>
+        <w:rPr>
+          <w:i/>
+        </w:rPr>
+        <w:t xml:space="preserve"> — and it comes with its own test: a cell where the symbol is </w:t>
+      </w:r>
+      <w:r>
+        <w:t>never stated*,</w:t>
+      </w:r>
+    </w:p>
+    <w:p>
+      <w:r>
+        <w:t>only emergent. Until such a need is demonstrated, the substrate stays deferred.</w:t>
+      </w:r>
+    </w:p>
+    <w:p>
+      <w:r>
+        <w:rPr>
+          <w:b/>
+        </w:rPr>
+        <w:t>Net principle: build mechanisms, not types.</w:t>
+      </w:r>
+      <w:r>
+        <w:t xml:space="preserve"> Count mechanisms (four, two working); add a new one</w:t>
+      </w:r>
+    </w:p>
+    <w:p>
+      <w:r>
+        <w:t>only when a cell proves that none of the four can carry an association — and gate the substrate on</w:t>
+      </w:r>
+    </w:p>
+    <w:p>
+      <w:r>
+        <w:t>the emergent-symbolism test, not on a someday-rung.</w:t>
+      </w:r>
+    </w:p>
+    <w:p>
+      <w:pPr>
+        <w:pStyle w:val="Heading1"/>
+      </w:pPr>
+      <w:r>
+        <w:t>9. Limitations and threats to validity</w:t>
       </w:r>
     </w:p>
     <w:p>
@@ -9035,7 +9749,7 @@
         <w:pStyle w:val="Heading1"/>
       </w:pPr>
       <w:r>
-        <w:t>9. Conclusion</w:t>
+        <w:t>10. Conclusion</w:t>
       </w:r>
     </w:p>
     <w:p>

</xml_diff>